<commit_message>
Remove step 2 from activity 2 worksheet
Co-Authored-By: Claude Opus 5.5 <noreply@anthropic.com>
Claude-Session: https://claude.ai/code/session_01EKMWS8WqxW1qonRyxSL5b1
</commit_message>
<xml_diff>
--- a/worksheet/activity2_x2.docx
+++ b/worksheet/activity2_x2.docx
@@ -1055,35 +1055,7 @@
     <w:p>
       <w:pPr>
         <w:bidi/>
-        <w:spacing w:after="20" w:before="80" w:line="290"/>
-        <w:jc w:val="right"/>
-      </w:pPr>
-      <w:r>
-        <w:rPr>
-          <w:rFonts w:ascii="Arial" w:cs="Arial" w:eastAsia="Arial" w:hAnsi="Arial"/>
-          <w:b/>
-          <w:bCs/>
-          <w:color w:val="B03A6B"/>
-          <w:sz w:val="25"/>
-          <w:szCs w:val="25"/>
-          <w:rtl/>
-        </w:rPr>
-        <w:t xml:space="preserve">2 </w:t>
-      </w:r>
-      <w:r>
-        <w:rPr>
-          <w:rFonts w:ascii="Arial" w:cs="Arial" w:eastAsia="Arial" w:hAnsi="Arial"/>
-          <w:sz w:val="25"/>
-          <w:szCs w:val="25"/>
-          <w:rtl/>
-        </w:rPr>
-        <w:t xml:space="preserve">نَعْرِضُ ما نَتَوَصَّلُ إِلَيْهِ أَمامَ الْمَجْموعاتِ الْأُخْرى.</w:t>
-      </w:r>
-    </w:p>
-    <w:p>
-      <w:pPr>
-        <w:bidi/>
-        <w:spacing w:after="0" w:before="0" w:line="290"/>
+        <w:spacing w:after="0" w:before="80" w:line="290"/>
         <w:jc w:val="right"/>
       </w:pPr>
       <w:r>
@@ -2183,35 +2155,7 @@
     <w:p>
       <w:pPr>
         <w:bidi/>
-        <w:spacing w:after="20" w:before="80" w:line="290"/>
-        <w:jc w:val="right"/>
-      </w:pPr>
-      <w:r>
-        <w:rPr>
-          <w:rFonts w:ascii="Arial" w:cs="Arial" w:eastAsia="Arial" w:hAnsi="Arial"/>
-          <w:b/>
-          <w:bCs/>
-          <w:color w:val="B03A6B"/>
-          <w:sz w:val="25"/>
-          <w:szCs w:val="25"/>
-          <w:rtl/>
-        </w:rPr>
-        <w:t xml:space="preserve">2 </w:t>
-      </w:r>
-      <w:r>
-        <w:rPr>
-          <w:rFonts w:ascii="Arial" w:cs="Arial" w:eastAsia="Arial" w:hAnsi="Arial"/>
-          <w:sz w:val="25"/>
-          <w:szCs w:val="25"/>
-          <w:rtl/>
-        </w:rPr>
-        <w:t xml:space="preserve">نَعْرِضُ ما نَتَوَصَّلُ إِلَيْهِ أَمامَ الْمَجْموعاتِ الْأُخْرى.</w:t>
-      </w:r>
-    </w:p>
-    <w:p>
-      <w:pPr>
-        <w:bidi/>
-        <w:spacing w:after="0" w:before="0" w:line="290"/>
+        <w:spacing w:after="0" w:before="80" w:line="290"/>
         <w:jc w:val="right"/>
       </w:pPr>
       <w:r>

</xml_diff>

<commit_message>
Worksheet: keep only basic Arabic diacritics
Co-Authored-By: Claude Opus 5.5 <noreply@anthropic.com>
Claude-Session: https://claude.ai/code/session_01EKMWS8WqxW1qonRyxSL5b1
</commit_message>
<xml_diff>
--- a/worksheet/activity2_x2.docx
+++ b/worksheet/activity2_x2.docx
@@ -19,7 +19,7 @@
           <w:shd w:fill="B03A6B" w:color="auto" w:val="clear"/>
           <w:rtl/>
         </w:rPr>
-        <w:t xml:space="preserve"> نَشاط 2 </w:t>
+        <w:t xml:space="preserve"> نشاط 2 </w:t>
       </w:r>
       <w:r>
         <w:rPr>
@@ -39,7 +39,7 @@
           <w:szCs w:val="30"/>
           <w:rtl/>
         </w:rPr>
-        <w:t xml:space="preserve">تَمْييزُ أَنْواعِ الْإِبْداعِ</w:t>
+        <w:t xml:space="preserve">تمييز أنواع الإبداع</w:t>
       </w:r>
     </w:p>
     <w:p>
@@ -58,7 +58,7 @@
           <w:szCs w:val="25"/>
           <w:rtl/>
         </w:rPr>
-        <w:t xml:space="preserve">خُطُواتُ الْعَمَلِ:</w:t>
+        <w:t xml:space="preserve">خطوات العمل:</w:t>
       </w:r>
     </w:p>
     <w:p>
@@ -86,7 +86,7 @@
           <w:szCs w:val="25"/>
           <w:rtl/>
         </w:rPr>
-        <w:t xml:space="preserve">أَتَعاوَنُ مَعَ أَفْرادِ مَجْموعَتي عَلى تَصْنيفِ أَنْواعِ الْفُنونِ وَالْإِبْداعاتِ الْوارِدَةِ في الصُّنْدوقِ وَفْقَ ما يُناسِبُها في الْجَدْوَلِ (1).</w:t>
+        <w:t xml:space="preserve">أَتعاونُ مع أفراد مجموعتي على تصنيف أنواع الفنون والإبداعات الواردة في الصّندوق وَفق ما يُناسبها في الجدول (1).</w:t>
       </w:r>
     </w:p>
     <w:p>
@@ -108,7 +108,7 @@
           <w:szCs w:val="25"/>
           <w:rtl/>
         </w:rPr>
-        <w:t xml:space="preserve">الْهَنْدَسَةُ - الْخَطابَةُ - الرَّسْمُ - الْإِلْقاءُ - الْبَريدُ الْإِلِكْتُرونِيُّ - الْمِصْباحُ الْكَهْرَبائِيُّ - آلاتُ الْمَسْحِ الرَّقْمِيَّةُ - الرِّواياتُ - الْمَرْكَباتُ الْكَهْرَبائِيَّةُ - النَّحْتُ - الْقِصَّةُ - التَّصْميمُ وَالْإِعْلانُ.</w:t>
+        <w:t xml:space="preserve">الهندسة - الخطابة - الرّسم - الإلقاء - البريد الإلكترونيّ - المصباح الكهربائيّ - آلات المسح الرّقميّة - الرّوايات - المركبات الكهربائيّة - النّحت - القصّة - التّصميم والإعلان.</w:t>
       </w:r>
     </w:p>
     <w:p>
@@ -126,7 +126,7 @@
           <w:szCs w:val="25"/>
           <w:rtl/>
         </w:rPr>
-        <w:t xml:space="preserve">الْجَدْوَلُ (1): تَصْنيفُ أَنْواعِ الْفُنونِ وَالْإِبْداعاتِ حَسَبَ أَنْماطِ التَّعَلُّمِ.</w:t>
+        <w:t xml:space="preserve">الجدول (1): تصنيف أنواع الفنون والإبداعات حسَب أنماط التّعلّم.</w:t>
       </w:r>
     </w:p>
     <w:tbl>
@@ -187,7 +187,7 @@
                 <w:szCs w:val="24"/>
                 <w:rtl/>
               </w:rPr>
-              <w:t xml:space="preserve">الْإِبْداعُ التِّكْنولوجِيُّ</w:t>
+              <w:t xml:space="preserve">الإبداع التّكنولوجيّ</w:t>
             </w:r>
           </w:p>
         </w:tc>
@@ -224,7 +224,7 @@
                 <w:szCs w:val="24"/>
                 <w:rtl/>
               </w:rPr>
-              <w:t xml:space="preserve">الْإِبْداعُ الْعِلْمِيُّ</w:t>
+              <w:t xml:space="preserve">الإبداع العلميّ</w:t>
             </w:r>
           </w:p>
         </w:tc>
@@ -261,7 +261,7 @@
                 <w:szCs w:val="24"/>
                 <w:rtl/>
               </w:rPr>
-              <w:t xml:space="preserve">الْإِبْداعُ الْأَدَبِيُّ</w:t>
+              <w:t xml:space="preserve">الإبداع الأدبيّ</w:t>
             </w:r>
           </w:p>
         </w:tc>
@@ -298,7 +298,7 @@
                 <w:szCs w:val="24"/>
                 <w:rtl/>
               </w:rPr>
-              <w:t xml:space="preserve">الْإِبْداعُ الصِّناعِيُّ</w:t>
+              <w:t xml:space="preserve">الإبداع الصّناعيّ</w:t>
             </w:r>
           </w:p>
         </w:tc>
@@ -335,7 +335,7 @@
                 <w:szCs w:val="24"/>
                 <w:rtl/>
               </w:rPr>
-              <w:t xml:space="preserve">الْإِبْداعُ الْحِرَفِيُّ وَالْفَنِّيُّ</w:t>
+              <w:t xml:space="preserve">الإبداع الحِرفيّ والفنّيّ</w:t>
             </w:r>
           </w:p>
         </w:tc>
@@ -372,7 +372,7 @@
                 <w:szCs w:val="24"/>
                 <w:rtl/>
               </w:rPr>
-              <w:t xml:space="preserve">الْإِبْداعُ اللُّغَوِيُّ</w:t>
+              <w:t xml:space="preserve">الإبداع اللّغويّ</w:t>
             </w:r>
           </w:p>
         </w:tc>
@@ -411,7 +411,7 @@
                 <w:szCs w:val="24"/>
                 <w:rtl/>
               </w:rPr>
-              <w:t xml:space="preserve">الْبَريدُ الْإِلِكْتُرونِيُّ</w:t>
+              <w:t xml:space="preserve">البريد الإلكترونيّ</w:t>
             </w:r>
           </w:p>
         </w:tc>
@@ -445,7 +445,7 @@
                 <w:szCs w:val="24"/>
                 <w:rtl/>
               </w:rPr>
-              <w:t xml:space="preserve">الْهَنْدَسَةُ</w:t>
+              <w:t xml:space="preserve">الهندسة</w:t>
             </w:r>
           </w:p>
         </w:tc>
@@ -479,7 +479,7 @@
                 <w:szCs w:val="24"/>
                 <w:rtl/>
               </w:rPr>
-              <w:t xml:space="preserve">الْقِصَّةُ</w:t>
+              <w:t xml:space="preserve">القصّة</w:t>
             </w:r>
           </w:p>
         </w:tc>
@@ -513,7 +513,7 @@
                 <w:szCs w:val="24"/>
                 <w:rtl/>
               </w:rPr>
-              <w:t xml:space="preserve">الْمَرْكَباتُ الْكَهْرَبائِيَّةُ</w:t>
+              <w:t xml:space="preserve">المركبات الكهربائيّة</w:t>
             </w:r>
           </w:p>
         </w:tc>
@@ -547,7 +547,7 @@
                 <w:szCs w:val="24"/>
                 <w:rtl/>
               </w:rPr>
-              <w:t xml:space="preserve">الرَّسْمُ</w:t>
+              <w:t xml:space="preserve">الرّسم</w:t>
             </w:r>
           </w:p>
         </w:tc>
@@ -581,7 +581,7 @@
                 <w:szCs w:val="24"/>
                 <w:rtl/>
               </w:rPr>
-              <w:t xml:space="preserve">الْإِلْقاءُ</w:t>
+              <w:t xml:space="preserve">الإلقاء</w:t>
             </w:r>
           </w:p>
         </w:tc>
@@ -1068,7 +1068,7 @@
           <w:szCs w:val="25"/>
           <w:rtl/>
         </w:rPr>
-        <w:t xml:space="preserve">أُفَكِّرُ: </w:t>
+        <w:t xml:space="preserve">أفكّر: </w:t>
       </w:r>
       <w:r>
         <w:rPr>
@@ -1079,7 +1079,7 @@
           <w:szCs w:val="25"/>
           <w:rtl/>
         </w:rPr>
-        <w:t xml:space="preserve">هَلِ الْإِبْداعُ فِطْرِيٌّ أَمْ مُكْتَسَبٌ؟</w:t>
+        <w:t xml:space="preserve">هل الإبداع فطريّ أم مكتسَب؟</w:t>
       </w:r>
     </w:p>
     <w:p>
@@ -1119,7 +1119,7 @@
           <w:shd w:fill="B03A6B" w:color="auto" w:val="clear"/>
           <w:rtl/>
         </w:rPr>
-        <w:t xml:space="preserve"> نَشاط 2 </w:t>
+        <w:t xml:space="preserve"> نشاط 2 </w:t>
       </w:r>
       <w:r>
         <w:rPr>
@@ -1139,7 +1139,7 @@
           <w:szCs w:val="30"/>
           <w:rtl/>
         </w:rPr>
-        <w:t xml:space="preserve">تَمْييزُ أَنْواعِ الْإِبْداعِ</w:t>
+        <w:t xml:space="preserve">تمييز أنواع الإبداع</w:t>
       </w:r>
     </w:p>
     <w:p>
@@ -1158,7 +1158,7 @@
           <w:szCs w:val="25"/>
           <w:rtl/>
         </w:rPr>
-        <w:t xml:space="preserve">خُطُواتُ الْعَمَلِ:</w:t>
+        <w:t xml:space="preserve">خطوات العمل:</w:t>
       </w:r>
     </w:p>
     <w:p>
@@ -1186,7 +1186,7 @@
           <w:szCs w:val="25"/>
           <w:rtl/>
         </w:rPr>
-        <w:t xml:space="preserve">أَتَعاوَنُ مَعَ أَفْرادِ مَجْموعَتي عَلى تَصْنيفِ أَنْواعِ الْفُنونِ وَالْإِبْداعاتِ الْوارِدَةِ في الصُّنْدوقِ وَفْقَ ما يُناسِبُها في الْجَدْوَلِ (1).</w:t>
+        <w:t xml:space="preserve">أَتعاونُ مع أفراد مجموعتي على تصنيف أنواع الفنون والإبداعات الواردة في الصّندوق وَفق ما يُناسبها في الجدول (1).</w:t>
       </w:r>
     </w:p>
     <w:p>
@@ -1208,7 +1208,7 @@
           <w:szCs w:val="25"/>
           <w:rtl/>
         </w:rPr>
-        <w:t xml:space="preserve">الْهَنْدَسَةُ - الْخَطابَةُ - الرَّسْمُ - الْإِلْقاءُ - الْبَريدُ الْإِلِكْتُرونِيُّ - الْمِصْباحُ الْكَهْرَبائِيُّ - آلاتُ الْمَسْحِ الرَّقْمِيَّةُ - الرِّواياتُ - الْمَرْكَباتُ الْكَهْرَبائِيَّةُ - النَّحْتُ - الْقِصَّةُ - التَّصْميمُ وَالْإِعْلانُ.</w:t>
+        <w:t xml:space="preserve">الهندسة - الخطابة - الرّسم - الإلقاء - البريد الإلكترونيّ - المصباح الكهربائيّ - آلات المسح الرّقميّة - الرّوايات - المركبات الكهربائيّة - النّحت - القصّة - التّصميم والإعلان.</w:t>
       </w:r>
     </w:p>
     <w:p>
@@ -1226,7 +1226,7 @@
           <w:szCs w:val="25"/>
           <w:rtl/>
         </w:rPr>
-        <w:t xml:space="preserve">الْجَدْوَلُ (1): تَصْنيفُ أَنْواعِ الْفُنونِ وَالْإِبْداعاتِ حَسَبَ أَنْماطِ التَّعَلُّمِ.</w:t>
+        <w:t xml:space="preserve">الجدول (1): تصنيف أنواع الفنون والإبداعات حسَب أنماط التّعلّم.</w:t>
       </w:r>
     </w:p>
     <w:tbl>
@@ -1287,7 +1287,7 @@
                 <w:szCs w:val="24"/>
                 <w:rtl/>
               </w:rPr>
-              <w:t xml:space="preserve">الْإِبْداعُ التِّكْنولوجِيُّ</w:t>
+              <w:t xml:space="preserve">الإبداع التّكنولوجيّ</w:t>
             </w:r>
           </w:p>
         </w:tc>
@@ -1324,7 +1324,7 @@
                 <w:szCs w:val="24"/>
                 <w:rtl/>
               </w:rPr>
-              <w:t xml:space="preserve">الْإِبْداعُ الْعِلْمِيُّ</w:t>
+              <w:t xml:space="preserve">الإبداع العلميّ</w:t>
             </w:r>
           </w:p>
         </w:tc>
@@ -1361,7 +1361,7 @@
                 <w:szCs w:val="24"/>
                 <w:rtl/>
               </w:rPr>
-              <w:t xml:space="preserve">الْإِبْداعُ الْأَدَبِيُّ</w:t>
+              <w:t xml:space="preserve">الإبداع الأدبيّ</w:t>
             </w:r>
           </w:p>
         </w:tc>
@@ -1398,7 +1398,7 @@
                 <w:szCs w:val="24"/>
                 <w:rtl/>
               </w:rPr>
-              <w:t xml:space="preserve">الْإِبْداعُ الصِّناعِيُّ</w:t>
+              <w:t xml:space="preserve">الإبداع الصّناعيّ</w:t>
             </w:r>
           </w:p>
         </w:tc>
@@ -1435,7 +1435,7 @@
                 <w:szCs w:val="24"/>
                 <w:rtl/>
               </w:rPr>
-              <w:t xml:space="preserve">الْإِبْداعُ الْحِرَفِيُّ وَالْفَنِّيُّ</w:t>
+              <w:t xml:space="preserve">الإبداع الحِرفيّ والفنّيّ</w:t>
             </w:r>
           </w:p>
         </w:tc>
@@ -1472,7 +1472,7 @@
                 <w:szCs w:val="24"/>
                 <w:rtl/>
               </w:rPr>
-              <w:t xml:space="preserve">الْإِبْداعُ اللُّغَوِيُّ</w:t>
+              <w:t xml:space="preserve">الإبداع اللّغويّ</w:t>
             </w:r>
           </w:p>
         </w:tc>
@@ -1511,7 +1511,7 @@
                 <w:szCs w:val="24"/>
                 <w:rtl/>
               </w:rPr>
-              <w:t xml:space="preserve">الْبَريدُ الْإِلِكْتُرونِيُّ</w:t>
+              <w:t xml:space="preserve">البريد الإلكترونيّ</w:t>
             </w:r>
           </w:p>
         </w:tc>
@@ -1545,7 +1545,7 @@
                 <w:szCs w:val="24"/>
                 <w:rtl/>
               </w:rPr>
-              <w:t xml:space="preserve">الْهَنْدَسَةُ</w:t>
+              <w:t xml:space="preserve">الهندسة</w:t>
             </w:r>
           </w:p>
         </w:tc>
@@ -1579,7 +1579,7 @@
                 <w:szCs w:val="24"/>
                 <w:rtl/>
               </w:rPr>
-              <w:t xml:space="preserve">الْقِصَّةُ</w:t>
+              <w:t xml:space="preserve">القصّة</w:t>
             </w:r>
           </w:p>
         </w:tc>
@@ -1613,7 +1613,7 @@
                 <w:szCs w:val="24"/>
                 <w:rtl/>
               </w:rPr>
-              <w:t xml:space="preserve">الْمَرْكَباتُ الْكَهْرَبائِيَّةُ</w:t>
+              <w:t xml:space="preserve">المركبات الكهربائيّة</w:t>
             </w:r>
           </w:p>
         </w:tc>
@@ -1647,7 +1647,7 @@
                 <w:szCs w:val="24"/>
                 <w:rtl/>
               </w:rPr>
-              <w:t xml:space="preserve">الرَّسْمُ</w:t>
+              <w:t xml:space="preserve">الرّسم</w:t>
             </w:r>
           </w:p>
         </w:tc>
@@ -1681,7 +1681,7 @@
                 <w:szCs w:val="24"/>
                 <w:rtl/>
               </w:rPr>
-              <w:t xml:space="preserve">الْإِلْقاءُ</w:t>
+              <w:t xml:space="preserve">الإلقاء</w:t>
             </w:r>
           </w:p>
         </w:tc>
@@ -2168,7 +2168,7 @@
           <w:szCs w:val="25"/>
           <w:rtl/>
         </w:rPr>
-        <w:t xml:space="preserve">أُفَكِّرُ: </w:t>
+        <w:t xml:space="preserve">أفكّر: </w:t>
       </w:r>
       <w:r>
         <w:rPr>
@@ -2179,7 +2179,7 @@
           <w:szCs w:val="25"/>
           <w:rtl/>
         </w:rPr>
-        <w:t xml:space="preserve">هَلِ الْإِبْداعُ فِطْرِيٌّ أَمْ مُكْتَسَبٌ؟</w:t>
+        <w:t xml:space="preserve">هل الإبداع فطريّ أم مكتسَب؟</w:t>
       </w:r>
     </w:p>
     <w:sectPr>

</xml_diff>